<commit_message>
feat(depenses): dépense payée au tiroir (B13, source « caisse »)
- Dépense « caisse » et sortie d'espèces (mouvement `depense` de Dev A) dans la même
  transaction, datée du jour, plafonnée aux espèces du tiroir.
- Caissière : sa caisse ouverte seulement, jamais les fonds propres ; vue restreinte
  « Dépenses de ma caisse ». Gérant : caisse choisie, sinon la sienne, sinon la seule ouverte.
- Annulation par contre-mouvement, refusée une fois la caisse clôturée.
- Contrat : ajouts seuls (`SaisieDepense.sessionId`, `Depense.sessionId`, `caissier`,
  `sessionCloturee`).
- REGLES_METIER § 10.2, UI_UX § 5.19, SCENARIOS_TEST AFI-15, guides gérant et caissière.

Co-Authored-By: Claude Opus 5.5 <noreply@anthropic.com>
</commit_message>
<xml_diff>
--- a/docs/SCENARIOS_TEST.docx
+++ b/docs/SCENARIOS_TEST.docx
@@ -3746,18 +3746,10 @@
     </w:p>
     <w:p>
       <w:pPr>
-        <w:pStyle w:val="Heading1"/>
-      </w:pPr>
-      <w:r>
-        <w:t>3. Kossi — gérant</w:t>
-      </w:r>
-    </w:p>
-    <w:p>
-      <w:pPr>
         <w:pStyle w:val="Heading2"/>
       </w:pPr>
       <w:r>
-        <w:t>KOS-01 — Catégories : rayons et sous-rayons</w:t>
+        <w:t>AFI-15 — Dépense payée au tiroir (puis annulée par le gérant)</w:t>
       </w:r>
     </w:p>
     <w:p>
@@ -3769,10 +3761,19 @@
         <w:rPr>
           <w:b/>
         </w:rPr>
-        <w:t>Étapes</w:t>
-      </w:r>
-      <w:r>
-        <w:t xml:space="preserve"> : créer le rayon « Hygiène » ; sur « Alimentation », icône « + » → sous-rayon « Conserves » ; renommer « Conserves » en « Conserves et sauces » ; créer un second rayon « boissons » ; désactiver « Hygiène » ; essayer de désactiver « Alimentation ».</w:t>
+        <w:t>Pré-requis</w:t>
+      </w:r>
+      <w:r>
+        <w:t xml:space="preserve"> : AFI-14 (caisse d'Afi clôturée). Afi rouvre sa caisse avec un fond de </w:t>
+      </w:r>
+      <w:r>
+        <w:rPr>
+          <w:b/>
+        </w:rPr>
+        <w:t>10 000</w:t>
+      </w:r>
+      <w:r>
+        <w:t>.</w:t>
       </w:r>
     </w:p>
     <w:p>
@@ -3784,10 +3785,28 @@
         <w:rPr>
           <w:b/>
         </w:rPr>
-        <w:t>Attendu</w:t>
-      </w:r>
-      <w:r>
-        <w:t xml:space="preserve"> : « boissons » est refusé (« Boissons » existe, majuscules ignorées). « Hygiène » (vide) se désactive ; « Alimentation » est refusée (« déplacez-les d'abord »). Les rayons actifs sont les onglets de la caisse.</w:t>
+        <w:t>Étapes</w:t>
+      </w:r>
+      <w:r>
+        <w:t xml:space="preserve"> : Afi, menu « Dépenses » : « Nouvelle dépense », Transport, « taxi-moto », </w:t>
+      </w:r>
+      <w:r>
+        <w:rPr>
+          <w:b/>
+        </w:rPr>
+        <w:t>1 000</w:t>
+      </w:r>
+      <w:r>
+        <w:t xml:space="preserve"> ; puis une deuxième de </w:t>
+      </w:r>
+      <w:r>
+        <w:rPr>
+          <w:b/>
+        </w:rPr>
+        <w:t>20 000</w:t>
+      </w:r>
+      <w:r>
+        <w:t xml:space="preserve"> ; « Clôture de caisse », « Imprimer le rapport X ». Kossi, menu « Dépenses » : annuler le taxi-moto (motif « erreur ») ; Afi réimprime le X.</w:t>
       </w:r>
     </w:p>
     <w:p>
@@ -3799,57 +3818,10 @@
         <w:rPr>
           <w:b/>
         </w:rPr>
-        <w:t>Résultat</w:t>
-      </w:r>
-      <w:r>
-        <w:t xml:space="preserve"> : ☐ OK ☐ KO — remarque :</w:t>
-      </w:r>
-    </w:p>
-    <w:p>
-      <w:pPr>
-        <w:pStyle w:val="Heading2"/>
-      </w:pPr>
-      <w:r>
-        <w:t>KOS-02 — Créer et modifier un produit</w:t>
-      </w:r>
-    </w:p>
-    <w:p>
-      <w:pPr>
-        <w:pStyle w:val="ListBullet"/>
-        <w:spacing w:after="40"/>
-      </w:pPr>
-      <w:r>
-        <w:rPr>
-          <w:b/>
-        </w:rPr>
-        <w:t>Étapes</w:t>
-      </w:r>
-      <w:r>
-        <w:t xml:space="preserve"> : « Nouveau produit » : « Sardines 125 g », rayon Alimentation › Conserves et sauces, TVA 18 %, seuil 12 ; Unité 400 F avec un code généré (icône « code-barres ») ; ajouter « Carton de 50 » à </w:t>
-      </w:r>
-      <w:r>
-        <w:rPr>
-          <w:b/>
-        </w:rPr>
-        <w:t>25 000</w:t>
-      </w:r>
-      <w:r>
-        <w:t xml:space="preserve"> F. Enregistrer. Puis modifier le prix du riz à 4 600 F.</w:t>
-      </w:r>
-    </w:p>
-    <w:p>
-      <w:pPr>
-        <w:pStyle w:val="ListBullet"/>
-        <w:spacing w:after="40"/>
-      </w:pPr>
-      <w:r>
-        <w:rPr>
-          <w:b/>
-        </w:rPr>
         <w:t>Attendu</w:t>
       </w:r>
       <w:r>
-        <w:t xml:space="preserve"> : code interne valide commençant par </w:t>
+        <w:t xml:space="preserve"> : la page d'Afi s'appelle « Dépenses de ma caisse », sans filtres, catégories ni annulation ; ni « Payée par » ni date dans la fenêtre. </w:t>
       </w:r>
       <w:r>
         <w:rPr>
@@ -3857,10 +3829,151 @@
           <w:color w:val="13294B"/>
           <w:sz w:val="18"/>
         </w:rPr>
-        <w:t>20</w:t>
-      </w:r>
-      <w:r>
-        <w:t>. Alerte (non bloquante) : le carton coûte plus cher que 50 unités (20 000 F). Le changement de prix du riz est au journal (</w:t>
+        <w:t>DEP-…</w:t>
+      </w:r>
+      <w:r>
+        <w:t xml:space="preserve"> ; 20 000 refusé (« Il n'y a que 9 000 F en caisse »). X : « Dépense (taxi-moto) » −1 000, espèces théoriques </w:t>
+      </w:r>
+      <w:r>
+        <w:rPr>
+          <w:b/>
+        </w:rPr>
+        <w:t>9 000</w:t>
+      </w:r>
+      <w:r>
+        <w:t xml:space="preserve">. Chez Kossi, « Payée par : Caisse (Afi) » ; après l'annulation, X à </w:t>
+      </w:r>
+      <w:r>
+        <w:rPr>
+          <w:b/>
+        </w:rPr>
+        <w:t>10 000</w:t>
+      </w:r>
+      <w:r>
+        <w:t xml:space="preserve"> (une entrée « Annulation… »). Après la clôture d'Afi, l'icône d'annulation disparaît et la liste d'Afi est vide.</w:t>
+      </w:r>
+    </w:p>
+    <w:p>
+      <w:pPr>
+        <w:pStyle w:val="ListBullet"/>
+        <w:spacing w:after="40"/>
+      </w:pPr>
+      <w:r>
+        <w:rPr>
+          <w:b/>
+        </w:rPr>
+        <w:t>Résultat</w:t>
+      </w:r>
+      <w:r>
+        <w:t xml:space="preserve"> : ☐ OK ☐ KO — remarque :</w:t>
+      </w:r>
+    </w:p>
+    <w:p>
+      <w:pPr>
+        <w:pStyle w:val="Heading1"/>
+      </w:pPr>
+      <w:r>
+        <w:t>3. Kossi — gérant</w:t>
+      </w:r>
+    </w:p>
+    <w:p>
+      <w:pPr>
+        <w:pStyle w:val="Heading2"/>
+      </w:pPr>
+      <w:r>
+        <w:t>KOS-01 — Catégories : rayons et sous-rayons</w:t>
+      </w:r>
+    </w:p>
+    <w:p>
+      <w:pPr>
+        <w:pStyle w:val="ListBullet"/>
+        <w:spacing w:after="40"/>
+      </w:pPr>
+      <w:r>
+        <w:rPr>
+          <w:b/>
+        </w:rPr>
+        <w:t>Étapes</w:t>
+      </w:r>
+      <w:r>
+        <w:t xml:space="preserve"> : créer le rayon « Hygiène » ; sur « Alimentation », icône « + » → sous-rayon « Conserves » ; renommer « Conserves » en « Conserves et sauces » ; créer un second rayon « boissons » ; désactiver « Hygiène » ; essayer de désactiver « Alimentation ».</w:t>
+      </w:r>
+    </w:p>
+    <w:p>
+      <w:pPr>
+        <w:pStyle w:val="ListBullet"/>
+        <w:spacing w:after="40"/>
+      </w:pPr>
+      <w:r>
+        <w:rPr>
+          <w:b/>
+        </w:rPr>
+        <w:t>Attendu</w:t>
+      </w:r>
+      <w:r>
+        <w:t xml:space="preserve"> : « boissons » est refusé (« Boissons » existe, majuscules ignorées). « Hygiène » (vide) se désactive ; « Alimentation » est refusée (« déplacez-les d'abord »). Les rayons actifs sont les onglets de la caisse.</w:t>
+      </w:r>
+    </w:p>
+    <w:p>
+      <w:pPr>
+        <w:pStyle w:val="ListBullet"/>
+        <w:spacing w:after="40"/>
+      </w:pPr>
+      <w:r>
+        <w:rPr>
+          <w:b/>
+        </w:rPr>
+        <w:t>Résultat</w:t>
+      </w:r>
+      <w:r>
+        <w:t xml:space="preserve"> : ☐ OK ☐ KO — remarque :</w:t>
+      </w:r>
+    </w:p>
+    <w:p>
+      <w:pPr>
+        <w:pStyle w:val="Heading2"/>
+      </w:pPr>
+      <w:r>
+        <w:t>KOS-02 — Créer et modifier un produit</w:t>
+      </w:r>
+    </w:p>
+    <w:p>
+      <w:pPr>
+        <w:pStyle w:val="ListBullet"/>
+        <w:spacing w:after="40"/>
+      </w:pPr>
+      <w:r>
+        <w:rPr>
+          <w:b/>
+        </w:rPr>
+        <w:t>Étapes</w:t>
+      </w:r>
+      <w:r>
+        <w:t xml:space="preserve"> : « Nouveau produit » : « Sardines 125 g », rayon Alimentation › Conserves et sauces, TVA 18 %, seuil 12 ; Unité 400 F avec un code généré (icône « code-barres ») ; ajouter « Carton de 50 » à </w:t>
+      </w:r>
+      <w:r>
+        <w:rPr>
+          <w:b/>
+        </w:rPr>
+        <w:t>25 000</w:t>
+      </w:r>
+      <w:r>
+        <w:t xml:space="preserve"> F. Enregistrer. Puis modifier le prix du riz à 4 600 F.</w:t>
+      </w:r>
+    </w:p>
+    <w:p>
+      <w:pPr>
+        <w:pStyle w:val="ListBullet"/>
+        <w:spacing w:after="40"/>
+      </w:pPr>
+      <w:r>
+        <w:rPr>
+          <w:b/>
+        </w:rPr>
+        <w:t>Attendu</w:t>
+      </w:r>
+      <w:r>
+        <w:t xml:space="preserve"> : code interne valide commençant par </w:t>
       </w:r>
       <w:r>
         <w:rPr>
@@ -3868,48 +3981,10 @@
           <w:color w:val="13294B"/>
           <w:sz w:val="18"/>
         </w:rPr>
-        <w:t>modification_prix</w:t>
-      </w:r>
-      <w:r>
-        <w:t>, PAT-05). La quantité de base d'un conditionnement existant n'est pas modifiable. Un code déjà utilisé par un autre article est refusé.</w:t>
-      </w:r>
-    </w:p>
-    <w:p>
-      <w:pPr>
-        <w:pStyle w:val="ListBullet"/>
-        <w:spacing w:after="40"/>
-      </w:pPr>
-      <w:r>
-        <w:rPr>
-          <w:b/>
-        </w:rPr>
-        <w:t>Résultat</w:t>
-      </w:r>
-      <w:r>
-        <w:t xml:space="preserve"> : ☐ OK ☐ KO — remarque :</w:t>
-      </w:r>
-    </w:p>
-    <w:p>
-      <w:pPr>
-        <w:pStyle w:val="Heading2"/>
-      </w:pPr>
-      <w:r>
-        <w:t>KOS-03 — Code inconnu scanné sur l'écran Produits</w:t>
-      </w:r>
-    </w:p>
-    <w:p>
-      <w:pPr>
-        <w:pStyle w:val="ListBullet"/>
-        <w:spacing w:after="40"/>
-      </w:pPr>
-      <w:r>
-        <w:rPr>
-          <w:b/>
-        </w:rPr>
-        <w:t>Étapes</w:t>
-      </w:r>
-      <w:r>
-        <w:t xml:space="preserve"> : dans la recherche, taper </w:t>
+        <w:t>20</w:t>
+      </w:r>
+      <w:r>
+        <w:t>. Alerte (non bloquante) : le carton coûte plus cher que 50 unités (20 000 F). Le changement de prix du riz est au journal (</w:t>
       </w:r>
       <w:r>
         <w:rPr>
@@ -3917,10 +3992,48 @@
           <w:color w:val="13294B"/>
           <w:sz w:val="18"/>
         </w:rPr>
-        <w:t>6034000099999</w:t>
-      </w:r>
-      <w:r>
-        <w:t xml:space="preserve"> puis Entrée ; puis </w:t>
+        <w:t>modification_prix</w:t>
+      </w:r>
+      <w:r>
+        <w:t>, PAT-05). La quantité de base d'un conditionnement existant n'est pas modifiable. Un code déjà utilisé par un autre article est refusé.</w:t>
+      </w:r>
+    </w:p>
+    <w:p>
+      <w:pPr>
+        <w:pStyle w:val="ListBullet"/>
+        <w:spacing w:after="40"/>
+      </w:pPr>
+      <w:r>
+        <w:rPr>
+          <w:b/>
+        </w:rPr>
+        <w:t>Résultat</w:t>
+      </w:r>
+      <w:r>
+        <w:t xml:space="preserve"> : ☐ OK ☐ KO — remarque :</w:t>
+      </w:r>
+    </w:p>
+    <w:p>
+      <w:pPr>
+        <w:pStyle w:val="Heading2"/>
+      </w:pPr>
+      <w:r>
+        <w:t>KOS-03 — Code inconnu scanné sur l'écran Produits</w:t>
+      </w:r>
+    </w:p>
+    <w:p>
+      <w:pPr>
+        <w:pStyle w:val="ListBullet"/>
+        <w:spacing w:after="40"/>
+      </w:pPr>
+      <w:r>
+        <w:rPr>
+          <w:b/>
+        </w:rPr>
+        <w:t>Étapes</w:t>
+      </w:r>
+      <w:r>
+        <w:t xml:space="preserve"> : dans la recherche, taper </w:t>
       </w:r>
       <w:r>
         <w:rPr>
@@ -3928,7 +4041,7 @@
           <w:color w:val="13294B"/>
           <w:sz w:val="18"/>
         </w:rPr>
-        <w:t>12</w:t>
+        <w:t>6034000099999</w:t>
       </w:r>
       <w:r>
         <w:t xml:space="preserve"> puis Entrée ; puis </w:t>
@@ -3939,25 +4052,10 @@
           <w:color w:val="13294B"/>
           <w:sz w:val="18"/>
         </w:rPr>
-        <w:t>123456</w:t>
-      </w:r>
-      <w:r>
-        <w:t xml:space="preserve"> puis Entrée.</w:t>
-      </w:r>
-    </w:p>
-    <w:p>
-      <w:pPr>
-        <w:pStyle w:val="ListBullet"/>
-        <w:spacing w:after="40"/>
-      </w:pPr>
-      <w:r>
-        <w:rPr>
-          <w:b/>
-        </w:rPr>
-        <w:t>Attendu</w:t>
-      </w:r>
-      <w:r>
-        <w:t xml:space="preserve"> : « Code 6034000099999 inconnu » avec « Créer le produit avec ce code », qui ouvre la fiche avec le code pré-rempli. </w:t>
+        <w:t>12</w:t>
+      </w:r>
+      <w:r>
+        <w:t xml:space="preserve"> puis Entrée ; puis </w:t>
       </w:r>
       <w:r>
         <w:rPr>
@@ -3965,10 +4063,25 @@
           <w:color w:val="13294B"/>
           <w:sz w:val="18"/>
         </w:rPr>
-        <w:t>12</w:t>
-      </w:r>
-      <w:r>
-        <w:t xml:space="preserve"> est un PLU valide (1 à 5 chiffres). </w:t>
+        <w:t>123456</w:t>
+      </w:r>
+      <w:r>
+        <w:t xml:space="preserve"> puis Entrée.</w:t>
+      </w:r>
+    </w:p>
+    <w:p>
+      <w:pPr>
+        <w:pStyle w:val="ListBullet"/>
+        <w:spacing w:after="40"/>
+      </w:pPr>
+      <w:r>
+        <w:rPr>
+          <w:b/>
+        </w:rPr>
+        <w:t>Attendu</w:t>
+      </w:r>
+      <w:r>
+        <w:t xml:space="preserve"> : « Code 6034000099999 inconnu » avec « Créer le produit avec ce code », qui ouvre la fiche avec le code pré-rempli. </w:t>
       </w:r>
       <w:r>
         <w:rPr>
@@ -3976,311 +4089,10 @@
           <w:color w:val="13294B"/>
           <w:sz w:val="18"/>
         </w:rPr>
-        <w:t>123456</w:t>
-      </w:r>
-      <w:r>
-        <w:t xml:space="preserve"> : « illisible » (ni code-barres de 8 à 14 chiffres, ni PLU).</w:t>
-      </w:r>
-    </w:p>
-    <w:p>
-      <w:pPr>
-        <w:pStyle w:val="ListBullet"/>
-        <w:spacing w:after="40"/>
-      </w:pPr>
-      <w:r>
-        <w:rPr>
-          <w:b/>
-        </w:rPr>
-        <w:t>Résultat</w:t>
-      </w:r>
-      <w:r>
-        <w:t xml:space="preserve"> : ☐ OK ☐ KO — remarque :</w:t>
-      </w:r>
-    </w:p>
-    <w:p>
-      <w:pPr>
-        <w:pStyle w:val="Heading2"/>
-      </w:pPr>
-      <w:r>
-        <w:t>KOS-04 — Importer le catalogue depuis Excel</w:t>
-      </w:r>
-    </w:p>
-    <w:p>
-      <w:pPr>
-        <w:pStyle w:val="ListBullet"/>
-        <w:spacing w:after="40"/>
-      </w:pPr>
-      <w:r>
-        <w:rPr>
-          <w:b/>
-        </w:rPr>
-        <w:t>Étapes</w:t>
-      </w:r>
-      <w:r>
-        <w:t xml:space="preserve"> : « Importer depuis Excel », « Télécharger le modèle » ; le remplir avec 25 produits (dont un rayon nouveau « Épicerie / Sucre », un produit sans code, une ligne sans prix) ; « Vérifier le fichier » ; corriger la ligne en erreur ; vérifier à nouveau ; « Importer ».</w:t>
-      </w:r>
-    </w:p>
-    <w:p>
-      <w:pPr>
-        <w:pStyle w:val="ListBullet"/>
-        <w:spacing w:after="40"/>
-      </w:pPr>
-      <w:r>
-        <w:rPr>
-          <w:b/>
-        </w:rPr>
-        <w:t>Attendu</w:t>
-      </w:r>
-      <w:r>
-        <w:t xml:space="preserve"> : rapport ligne par ligne, erreurs en premier ; </w:t>
-      </w:r>
-      <w:r>
-        <w:rPr>
-          <w:b/>
-        </w:rPr>
-        <w:t>une ligne en erreur bloque tout</w:t>
-      </w:r>
-      <w:r>
-        <w:t xml:space="preserve"> (bouton d'import grisé). Après correction : « 25 produits importés », rayon et sous-rayon créés. Réimporter le même fichier : tout est « Ignorée », aucun doublon. Aucun mouvement de stock créé.</w:t>
-      </w:r>
-    </w:p>
-    <w:p>
-      <w:pPr>
-        <w:pStyle w:val="ListBullet"/>
-        <w:spacing w:after="40"/>
-      </w:pPr>
-      <w:r>
-        <w:rPr>
-          <w:b/>
-        </w:rPr>
-        <w:t>Résultat</w:t>
-      </w:r>
-      <w:r>
-        <w:t xml:space="preserve"> : ☐ OK ☐ KO — remarque :</w:t>
-      </w:r>
-    </w:p>
-    <w:p>
-      <w:pPr>
-        <w:pStyle w:val="Heading2"/>
-      </w:pPr>
-      <w:r>
-        <w:t>KOS-05 — Stock initial des produits importés</w:t>
-      </w:r>
-    </w:p>
-    <w:p>
-      <w:pPr>
-        <w:pStyle w:val="ListBullet"/>
-        <w:spacing w:after="40"/>
-      </w:pPr>
-      <w:r>
-        <w:rPr>
-          <w:b/>
-        </w:rPr>
-        <w:t>Étapes</w:t>
-      </w:r>
-      <w:r>
-        <w:t xml:space="preserve"> : « Stock initial », filtre « À compter » ; « Compter » un produit importé : 1 carton de 24 + 5 lots de 3 + 2 unités si ces conditionnements existent, sinon </w:t>
-      </w:r>
-      <w:r>
-        <w:rPr>
-          <w:b/>
-        </w:rPr>
-        <w:t>41</w:t>
-      </w:r>
-      <w:r>
-        <w:t xml:space="preserve"> unités ; coût par unité 250 ; enregistrer. Puis l'annuler (motif) et le recompter.</w:t>
-      </w:r>
-    </w:p>
-    <w:p>
-      <w:pPr>
-        <w:pStyle w:val="ListBullet"/>
-        <w:spacing w:after="40"/>
-      </w:pPr>
-      <w:r>
-        <w:rPr>
-          <w:b/>
-        </w:rPr>
-        <w:t>Attendu</w:t>
-      </w:r>
-      <w:r>
-        <w:t xml:space="preserve"> : stock </w:t>
-      </w:r>
-      <w:r>
-        <w:rPr>
-          <w:b/>
-        </w:rPr>
-        <w:t>41</w:t>
-      </w:r>
-      <w:r>
-        <w:t xml:space="preserve">, coût moyen = </w:t>
-      </w:r>
-      <w:r>
-        <w:rPr>
-          <w:b/>
-        </w:rPr>
-        <w:t>250</w:t>
-      </w:r>
-      <w:r>
-        <w:t xml:space="preserve"> exactement ; le produit passe en « Compté ». Les produits de la démo sont « Non concernés » (ils ont déjà des entrées). L'annulation contre-passe le mouvement et le produit redevient « À compter ». Comptage 0 refusé.</w:t>
-      </w:r>
-    </w:p>
-    <w:p>
-      <w:pPr>
-        <w:pStyle w:val="ListBullet"/>
-        <w:spacing w:after="40"/>
-      </w:pPr>
-      <w:r>
-        <w:rPr>
-          <w:b/>
-        </w:rPr>
-        <w:t>Résultat</w:t>
-      </w:r>
-      <w:r>
-        <w:t xml:space="preserve"> : ☐ OK ☐ KO — remarque :</w:t>
-      </w:r>
-    </w:p>
-    <w:p>
-      <w:pPr>
-        <w:pStyle w:val="Heading2"/>
-      </w:pPr>
-      <w:r>
-        <w:t>KOS-06 — Consulter le stock et l'historique d'un produit</w:t>
-      </w:r>
-    </w:p>
-    <w:p>
-      <w:pPr>
-        <w:pStyle w:val="ListBullet"/>
-        <w:spacing w:after="40"/>
-      </w:pPr>
-      <w:r>
-        <w:rPr>
-          <w:b/>
-        </w:rPr>
-        <w:t>Étapes</w:t>
-      </w:r>
-      <w:r>
-        <w:t xml:space="preserve"> : « Stock » ; filtre « Ruptures et stocks bas » ; icône « Historique » de la tomate.</w:t>
-      </w:r>
-    </w:p>
-    <w:p>
-      <w:pPr>
-        <w:pStyle w:val="ListBullet"/>
-        <w:spacing w:after="40"/>
-      </w:pPr>
-      <w:r>
-        <w:rPr>
-          <w:b/>
-        </w:rPr>
-        <w:t>Attendu</w:t>
-      </w:r>
-      <w:r>
-        <w:t xml:space="preserve"> : valeur totale du stock en tête ; répartition indicative sous le stock (72 = « 3 Carton de 24 ») ; l'historique part du stock au début de la période, liste chaque mouvement avec le stock après, l'auteur et le document (n° de ticket, RC, INV…), entrées en vert, sorties en rouge, et finit sur le stock actuel.</w:t>
-      </w:r>
-    </w:p>
-    <w:p>
-      <w:pPr>
-        <w:pStyle w:val="ListBullet"/>
-        <w:spacing w:after="40"/>
-      </w:pPr>
-      <w:r>
-        <w:rPr>
-          <w:b/>
-        </w:rPr>
-        <w:t>Résultat</w:t>
-      </w:r>
-      <w:r>
-        <w:t xml:space="preserve"> : ☐ OK ☐ KO — remarque :</w:t>
-      </w:r>
-    </w:p>
-    <w:p>
-      <w:pPr>
-        <w:pStyle w:val="Heading2"/>
-      </w:pPr>
-      <w:r>
-        <w:t>KOS-07 — Fiches fournisseurs</w:t>
-      </w:r>
-    </w:p>
-    <w:p>
-      <w:pPr>
-        <w:pStyle w:val="ListBullet"/>
-        <w:spacing w:after="40"/>
-      </w:pPr>
-      <w:r>
-        <w:rPr>
-          <w:b/>
-        </w:rPr>
-        <w:t>Étapes</w:t>
-      </w:r>
-      <w:r>
-        <w:t xml:space="preserve"> : créer « Brasserie BB Lomé », délai 30 j ; en créer un second « brasserie bb lomé » ; modifier le téléphone ; essayer de désactiver le Grossiste après KOS-09.</w:t>
-      </w:r>
-    </w:p>
-    <w:p>
-      <w:pPr>
-        <w:pStyle w:val="ListBullet"/>
-        <w:spacing w:after="40"/>
-      </w:pPr>
-      <w:r>
-        <w:rPr>
-          <w:b/>
-        </w:rPr>
-        <w:t>Attendu</w:t>
-      </w:r>
-      <w:r>
-        <w:t xml:space="preserve"> : le doublon est refusé (majuscules et espaces ignorés). Délai hors 0–365 refusé. Désactivation du Grossiste refusée tant qu'il reste une dette ; celle de la Brasserie (aucune dette) acceptée, avec motif.</w:t>
-      </w:r>
-    </w:p>
-    <w:p>
-      <w:pPr>
-        <w:pStyle w:val="ListBullet"/>
-        <w:spacing w:after="40"/>
-      </w:pPr>
-      <w:r>
-        <w:rPr>
-          <w:b/>
-        </w:rPr>
-        <w:t>Résultat</w:t>
-      </w:r>
-      <w:r>
-        <w:t xml:space="preserve"> : ☐ OK ☐ KO — remarque :</w:t>
-      </w:r>
-    </w:p>
-    <w:p>
-      <w:pPr>
-        <w:pStyle w:val="Heading2"/>
-      </w:pPr>
-      <w:r>
-        <w:t>KOS-08 — Commande fournisseur</w:t>
-      </w:r>
-    </w:p>
-    <w:p>
-      <w:pPr>
-        <w:pStyle w:val="ListBullet"/>
-        <w:spacing w:after="40"/>
-      </w:pPr>
-      <w:r>
-        <w:rPr>
-          <w:b/>
-        </w:rPr>
-        <w:t>Étapes</w:t>
-      </w:r>
-      <w:r>
-        <w:t xml:space="preserve"> : « Nouvelle commande », Grossiste ; « Proposer depuis les alertes » (cocher un produit en page 1 et un autre en page 2 si la liste est longue) ; ajouter 3 × Carton de 24 de tomate ; enregistrer ; « Marquer comme envoyée » ; « Copier le texte ».</w:t>
-      </w:r>
-    </w:p>
-    <w:p>
-      <w:pPr>
-        <w:pStyle w:val="ListBullet"/>
-        <w:spacing w:after="40"/>
-      </w:pPr>
-      <w:r>
-        <w:rPr>
-          <w:b/>
-        </w:rPr>
-        <w:t>Attendu</w:t>
-      </w:r>
-      <w:r>
-        <w:t xml:space="preserve"> : numéro </w:t>
+        <w:t>12</w:t>
+      </w:r>
+      <w:r>
+        <w:t xml:space="preserve"> est un PLU valide (1 à 5 chiffres). </w:t>
       </w:r>
       <w:r>
         <w:rPr>
@@ -4288,10 +4100,10 @@
           <w:color w:val="13294B"/>
           <w:sz w:val="18"/>
         </w:rPr>
-        <w:t>CA-AAAA-NNNNNN</w:t>
-      </w:r>
-      <w:r>
-        <w:t xml:space="preserve"> dès le brouillon ; conversion en direct « = 72 boîtes » ; aucune quantité calculée par l'application ; une fois envoyée, la commande ne se modifie plus. Annuler demande un motif.</w:t>
+        <w:t>123456</w:t>
+      </w:r>
+      <w:r>
+        <w:t xml:space="preserve"> : « illisible » (ni code-barres de 8 à 14 chiffres, ni PLU).</w:t>
       </w:r>
     </w:p>
     <w:p>
@@ -4314,7 +4126,7 @@
         <w:pStyle w:val="Heading2"/>
       </w:pPr>
       <w:r>
-        <w:t>KOS-09 — Réception d'une livraison (CUMP, lots, dette)</w:t>
+        <w:t>KOS-04 — Importer le catalogue depuis Excel</w:t>
       </w:r>
     </w:p>
     <w:p>
@@ -4329,61 +4141,270 @@
         <w:t>Étapes</w:t>
       </w:r>
       <w:r>
-        <w:t xml:space="preserve"> : « Nouvelle réception », Grossiste ; « Livrer CA-… » (KOS-08) ou saisie libre :</w:t>
-      </w:r>
-    </w:p>
-    <w:p>
-      <w:pPr>
-        <w:pStyle w:val="ListBullet2"/>
+        <w:t xml:space="preserve"> : « Importer depuis Excel », « Télécharger le modèle » ; le remplir avec 25 produits (dont un rayon nouveau « Épicerie / Sucre », un produit sans code, une ligne sans prix) ; « Vérifier le fichier » ; corriger la ligne en erreur ; vérifier à nouveau ; « Importer ».</w:t>
+      </w:r>
+    </w:p>
+    <w:p>
+      <w:pPr>
+        <w:pStyle w:val="ListBullet"/>
         <w:spacing w:after="40"/>
       </w:pPr>
       <w:r>
-        <w:t xml:space="preserve">Tomate — Carton de 24, qté </w:t>
-      </w:r>
-      <w:r>
         <w:rPr>
           <w:b/>
         </w:rPr>
-        <w:t>3</w:t>
-      </w:r>
-      <w:r>
-        <w:t xml:space="preserve">, prix </w:t>
+        <w:t>Attendu</w:t>
+      </w:r>
+      <w:r>
+        <w:t xml:space="preserve"> : rapport ligne par ligne, erreurs en premier ; </w:t>
       </w:r>
       <w:r>
         <w:rPr>
           <w:b/>
         </w:rPr>
-        <w:t>6 000</w:t>
-      </w:r>
-      <w:r>
-        <w:t xml:space="preserve"> ;</w:t>
-      </w:r>
-    </w:p>
-    <w:p>
-      <w:pPr>
-        <w:pStyle w:val="ListBullet2"/>
+        <w:t>une ligne en erreur bloque tout</w:t>
+      </w:r>
+      <w:r>
+        <w:t xml:space="preserve"> (bouton d'import grisé). Après correction : « 25 produits importés », rayon et sous-rayon créés. Réimporter le même fichier : tout est « Ignorée », aucun doublon. Aucun mouvement de stock créé.</w:t>
+      </w:r>
+    </w:p>
+    <w:p>
+      <w:pPr>
+        <w:pStyle w:val="ListBullet"/>
         <w:spacing w:after="40"/>
       </w:pPr>
       <w:r>
-        <w:t xml:space="preserve">Lait en poudre, qté </w:t>
-      </w:r>
-      <w:r>
         <w:rPr>
           <w:b/>
         </w:rPr>
-        <w:t>12</w:t>
-      </w:r>
-      <w:r>
-        <w:t xml:space="preserve">, prix </w:t>
-      </w:r>
+        <w:t>Résultat</w:t>
+      </w:r>
+      <w:r>
+        <w:t xml:space="preserve"> : ☐ OK ☐ KO — remarque :</w:t>
+      </w:r>
+    </w:p>
+    <w:p>
+      <w:pPr>
+        <w:pStyle w:val="Heading2"/>
+      </w:pPr>
+      <w:r>
+        <w:t>KOS-05 — Stock initial des produits importés</w:t>
+      </w:r>
+    </w:p>
+    <w:p>
+      <w:pPr>
+        <w:pStyle w:val="ListBullet"/>
+        <w:spacing w:after="40"/>
+      </w:pPr>
       <w:r>
         <w:rPr>
           <w:b/>
         </w:rPr>
-        <w:t>2 100</w:t>
-      </w:r>
-      <w:r>
-        <w:t xml:space="preserve">, lot </w:t>
+        <w:t>Étapes</w:t>
+      </w:r>
+      <w:r>
+        <w:t xml:space="preserve"> : « Stock initial », filtre « À compter » ; « Compter » un produit importé : 1 carton de 24 + 5 lots de 3 + 2 unités si ces conditionnements existent, sinon </w:t>
+      </w:r>
+      <w:r>
+        <w:rPr>
+          <w:b/>
+        </w:rPr>
+        <w:t>41</w:t>
+      </w:r>
+      <w:r>
+        <w:t xml:space="preserve"> unités ; coût par unité 250 ; enregistrer. Puis l'annuler (motif) et le recompter.</w:t>
+      </w:r>
+    </w:p>
+    <w:p>
+      <w:pPr>
+        <w:pStyle w:val="ListBullet"/>
+        <w:spacing w:after="40"/>
+      </w:pPr>
+      <w:r>
+        <w:rPr>
+          <w:b/>
+        </w:rPr>
+        <w:t>Attendu</w:t>
+      </w:r>
+      <w:r>
+        <w:t xml:space="preserve"> : stock </w:t>
+      </w:r>
+      <w:r>
+        <w:rPr>
+          <w:b/>
+        </w:rPr>
+        <w:t>41</w:t>
+      </w:r>
+      <w:r>
+        <w:t xml:space="preserve">, coût moyen = </w:t>
+      </w:r>
+      <w:r>
+        <w:rPr>
+          <w:b/>
+        </w:rPr>
+        <w:t>250</w:t>
+      </w:r>
+      <w:r>
+        <w:t xml:space="preserve"> exactement ; le produit passe en « Compté ». Les produits de la démo sont « Non concernés » (ils ont déjà des entrées). L'annulation contre-passe le mouvement et le produit redevient « À compter ». Comptage 0 refusé.</w:t>
+      </w:r>
+    </w:p>
+    <w:p>
+      <w:pPr>
+        <w:pStyle w:val="ListBullet"/>
+        <w:spacing w:after="40"/>
+      </w:pPr>
+      <w:r>
+        <w:rPr>
+          <w:b/>
+        </w:rPr>
+        <w:t>Résultat</w:t>
+      </w:r>
+      <w:r>
+        <w:t xml:space="preserve"> : ☐ OK ☐ KO — remarque :</w:t>
+      </w:r>
+    </w:p>
+    <w:p>
+      <w:pPr>
+        <w:pStyle w:val="Heading2"/>
+      </w:pPr>
+      <w:r>
+        <w:t>KOS-06 — Consulter le stock et l'historique d'un produit</w:t>
+      </w:r>
+    </w:p>
+    <w:p>
+      <w:pPr>
+        <w:pStyle w:val="ListBullet"/>
+        <w:spacing w:after="40"/>
+      </w:pPr>
+      <w:r>
+        <w:rPr>
+          <w:b/>
+        </w:rPr>
+        <w:t>Étapes</w:t>
+      </w:r>
+      <w:r>
+        <w:t xml:space="preserve"> : « Stock » ; filtre « Ruptures et stocks bas » ; icône « Historique » de la tomate.</w:t>
+      </w:r>
+    </w:p>
+    <w:p>
+      <w:pPr>
+        <w:pStyle w:val="ListBullet"/>
+        <w:spacing w:after="40"/>
+      </w:pPr>
+      <w:r>
+        <w:rPr>
+          <w:b/>
+        </w:rPr>
+        <w:t>Attendu</w:t>
+      </w:r>
+      <w:r>
+        <w:t xml:space="preserve"> : valeur totale du stock en tête ; répartition indicative sous le stock (72 = « 3 Carton de 24 ») ; l'historique part du stock au début de la période, liste chaque mouvement avec le stock après, l'auteur et le document (n° de ticket, RC, INV…), entrées en vert, sorties en rouge, et finit sur le stock actuel.</w:t>
+      </w:r>
+    </w:p>
+    <w:p>
+      <w:pPr>
+        <w:pStyle w:val="ListBullet"/>
+        <w:spacing w:after="40"/>
+      </w:pPr>
+      <w:r>
+        <w:rPr>
+          <w:b/>
+        </w:rPr>
+        <w:t>Résultat</w:t>
+      </w:r>
+      <w:r>
+        <w:t xml:space="preserve"> : ☐ OK ☐ KO — remarque :</w:t>
+      </w:r>
+    </w:p>
+    <w:p>
+      <w:pPr>
+        <w:pStyle w:val="Heading2"/>
+      </w:pPr>
+      <w:r>
+        <w:t>KOS-07 — Fiches fournisseurs</w:t>
+      </w:r>
+    </w:p>
+    <w:p>
+      <w:pPr>
+        <w:pStyle w:val="ListBullet"/>
+        <w:spacing w:after="40"/>
+      </w:pPr>
+      <w:r>
+        <w:rPr>
+          <w:b/>
+        </w:rPr>
+        <w:t>Étapes</w:t>
+      </w:r>
+      <w:r>
+        <w:t xml:space="preserve"> : créer « Brasserie BB Lomé », délai 30 j ; en créer un second « brasserie bb lomé » ; modifier le téléphone ; essayer de désactiver le Grossiste après KOS-09.</w:t>
+      </w:r>
+    </w:p>
+    <w:p>
+      <w:pPr>
+        <w:pStyle w:val="ListBullet"/>
+        <w:spacing w:after="40"/>
+      </w:pPr>
+      <w:r>
+        <w:rPr>
+          <w:b/>
+        </w:rPr>
+        <w:t>Attendu</w:t>
+      </w:r>
+      <w:r>
+        <w:t xml:space="preserve"> : le doublon est refusé (majuscules et espaces ignorés). Délai hors 0–365 refusé. Désactivation du Grossiste refusée tant qu'il reste une dette ; celle de la Brasserie (aucune dette) acceptée, avec motif.</w:t>
+      </w:r>
+    </w:p>
+    <w:p>
+      <w:pPr>
+        <w:pStyle w:val="ListBullet"/>
+        <w:spacing w:after="40"/>
+      </w:pPr>
+      <w:r>
+        <w:rPr>
+          <w:b/>
+        </w:rPr>
+        <w:t>Résultat</w:t>
+      </w:r>
+      <w:r>
+        <w:t xml:space="preserve"> : ☐ OK ☐ KO — remarque :</w:t>
+      </w:r>
+    </w:p>
+    <w:p>
+      <w:pPr>
+        <w:pStyle w:val="Heading2"/>
+      </w:pPr>
+      <w:r>
+        <w:t>KOS-08 — Commande fournisseur</w:t>
+      </w:r>
+    </w:p>
+    <w:p>
+      <w:pPr>
+        <w:pStyle w:val="ListBullet"/>
+        <w:spacing w:after="40"/>
+      </w:pPr>
+      <w:r>
+        <w:rPr>
+          <w:b/>
+        </w:rPr>
+        <w:t>Étapes</w:t>
+      </w:r>
+      <w:r>
+        <w:t xml:space="preserve"> : « Nouvelle commande », Grossiste ; « Proposer depuis les alertes » (cocher un produit en page 1 et un autre en page 2 si la liste est longue) ; ajouter 3 × Carton de 24 de tomate ; enregistrer ; « Marquer comme envoyée » ; « Copier le texte ».</w:t>
+      </w:r>
+    </w:p>
+    <w:p>
+      <w:pPr>
+        <w:pStyle w:val="ListBullet"/>
+        <w:spacing w:after="40"/>
+      </w:pPr>
+      <w:r>
+        <w:rPr>
+          <w:b/>
+        </w:rPr>
+        <w:t>Attendu</w:t>
+      </w:r>
+      <w:r>
+        <w:t xml:space="preserve"> : numéro </w:t>
       </w:r>
       <w:r>
         <w:rPr>
@@ -4391,10 +4412,48 @@
           <w:color w:val="13294B"/>
           <w:sz w:val="18"/>
         </w:rPr>
-        <w:t>LOT-B03</w:t>
-      </w:r>
-      <w:r>
-        <w:t>, date dans 60 jours ;</w:t>
+        <w:t>CA-AAAA-NNNNNN</w:t>
+      </w:r>
+      <w:r>
+        <w:t xml:space="preserve"> dès le brouillon ; conversion en direct « = 72 boîtes » ; aucune quantité calculée par l'application ; une fois envoyée, la commande ne se modifie plus. Annuler demande un motif.</w:t>
+      </w:r>
+    </w:p>
+    <w:p>
+      <w:pPr>
+        <w:pStyle w:val="ListBullet"/>
+        <w:spacing w:after="40"/>
+      </w:pPr>
+      <w:r>
+        <w:rPr>
+          <w:b/>
+        </w:rPr>
+        <w:t>Résultat</w:t>
+      </w:r>
+      <w:r>
+        <w:t xml:space="preserve"> : ☐ OK ☐ KO — remarque :</w:t>
+      </w:r>
+    </w:p>
+    <w:p>
+      <w:pPr>
+        <w:pStyle w:val="Heading2"/>
+      </w:pPr>
+      <w:r>
+        <w:t>KOS-09 — Réception d'une livraison (CUMP, lots, dette)</w:t>
+      </w:r>
+    </w:p>
+    <w:p>
+      <w:pPr>
+        <w:pStyle w:val="ListBullet"/>
+        <w:spacing w:after="40"/>
+      </w:pPr>
+      <w:r>
+        <w:rPr>
+          <w:b/>
+        </w:rPr>
+        <w:t>Étapes</w:t>
+      </w:r>
+      <w:r>
+        <w:t xml:space="preserve"> : « Nouvelle réception », Grossiste ; « Livrer CA-… » (KOS-08) ou saisie libre :</w:t>
       </w:r>
     </w:p>
     <w:p>
@@ -4403,7 +4462,52 @@
         <w:spacing w:after="40"/>
       </w:pPr>
       <w:r>
-        <w:t xml:space="preserve">scanner </w:t>
+        <w:t xml:space="preserve">Tomate — Carton de 24, qté </w:t>
+      </w:r>
+      <w:r>
+        <w:rPr>
+          <w:b/>
+        </w:rPr>
+        <w:t>3</w:t>
+      </w:r>
+      <w:r>
+        <w:t xml:space="preserve">, prix </w:t>
+      </w:r>
+      <w:r>
+        <w:rPr>
+          <w:b/>
+        </w:rPr>
+        <w:t>6 000</w:t>
+      </w:r>
+      <w:r>
+        <w:t xml:space="preserve"> ;</w:t>
+      </w:r>
+    </w:p>
+    <w:p>
+      <w:pPr>
+        <w:pStyle w:val="ListBullet2"/>
+        <w:spacing w:after="40"/>
+      </w:pPr>
+      <w:r>
+        <w:t xml:space="preserve">Lait en poudre, qté </w:t>
+      </w:r>
+      <w:r>
+        <w:rPr>
+          <w:b/>
+        </w:rPr>
+        <w:t>12</w:t>
+      </w:r>
+      <w:r>
+        <w:t xml:space="preserve">, prix </w:t>
+      </w:r>
+      <w:r>
+        <w:rPr>
+          <w:b/>
+        </w:rPr>
+        <w:t>2 100</w:t>
+      </w:r>
+      <w:r>
+        <w:t xml:space="preserve">, lot </w:t>
       </w:r>
       <w:r>
         <w:rPr>
@@ -4411,10 +4515,19 @@
           <w:color w:val="13294B"/>
           <w:sz w:val="18"/>
         </w:rPr>
-        <w:t>6034000099999</w:t>
-      </w:r>
-      <w:r>
-        <w:t xml:space="preserve"> → « Créer le produit » « Jus de mangue 1 L » (Boissons, 18 %, suivi de péremption, Unité 650 F) → retour à la réception, qté 6, prix 400, lot </w:t>
+        <w:t>LOT-B03</w:t>
+      </w:r>
+      <w:r>
+        <w:t>, date dans 60 jours ;</w:t>
+      </w:r>
+    </w:p>
+    <w:p>
+      <w:pPr>
+        <w:pStyle w:val="ListBullet2"/>
+        <w:spacing w:after="40"/>
+      </w:pPr>
+      <w:r>
+        <w:t xml:space="preserve">scanner </w:t>
       </w:r>
       <w:r>
         <w:rPr>
@@ -4422,34 +4535,10 @@
           <w:color w:val="13294B"/>
           <w:sz w:val="18"/>
         </w:rPr>
-        <w:t>M01</w:t>
-      </w:r>
-      <w:r>
-        <w:t>, date dans 30 j. Puis « Valider la réception ».</w:t>
-      </w:r>
-    </w:p>
-    <w:p>
-      <w:pPr>
-        <w:pStyle w:val="ListBullet"/>
-        <w:spacing w:after="40"/>
-      </w:pPr>
-      <w:r>
-        <w:rPr>
-          <w:b/>
-        </w:rPr>
-        <w:t>Attendu</w:t>
-      </w:r>
-      <w:r>
-        <w:t xml:space="preserve"> : sous la ligne tomate « = 72 boîtes à 250 F/boîte » ; lot et date exigés pour le lait et le jus (date passée refusée). Total </w:t>
-      </w:r>
-      <w:r>
-        <w:rPr>
-          <w:b/>
-        </w:rPr>
-        <w:t>45 600 F</w:t>
-      </w:r>
-      <w:r>
-        <w:t xml:space="preserve"> (18 000 + 25 200 + 2 400). Numéro </w:t>
+        <w:t>6034000099999</w:t>
+      </w:r>
+      <w:r>
+        <w:t xml:space="preserve"> → « Créer le produit » « Jus de mangue 1 L » (Boissons, 18 %, suivi de péremption, Unité 650 F) → retour à la réception, qté 6, prix 400, lot </w:t>
       </w:r>
       <w:r>
         <w:rPr>
@@ -4457,19 +4546,10 @@
           <w:color w:val="13294B"/>
           <w:sz w:val="18"/>
         </w:rPr>
-        <w:t>RC</w:t>
-      </w:r>
-      <w:r>
-        <w:t xml:space="preserve"> attribué à la validation. Tomate : stock +72, coût moyen </w:t>
-      </w:r>
-      <w:r>
-        <w:rPr>
-          <w:b/>
-        </w:rPr>
-        <w:t>250</w:t>
-      </w:r>
-      <w:r>
-        <w:t>. Dette du Grossiste = 45 600 F, échéance aujourd'hui + 15 j. Commande liée : « Reçue ». Une réception validée ne se modifie plus.</w:t>
+        <w:t>M01</w:t>
+      </w:r>
+      <w:r>
+        <w:t>, date dans 30 j. Puis « Valider la réception ».</w:t>
       </w:r>
     </w:p>
     <w:p>
@@ -4481,241 +4561,19 @@
         <w:rPr>
           <w:b/>
         </w:rPr>
-        <w:t>Résultat</w:t>
-      </w:r>
-      <w:r>
-        <w:t xml:space="preserve"> : ☐ OK ☐ KO — remarque :</w:t>
-      </w:r>
-    </w:p>
-    <w:p>
-      <w:pPr>
-        <w:pStyle w:val="Heading2"/>
-      </w:pPr>
-      <w:r>
-        <w:t>KOS-10 — Évolution du coût moyen (CUMP)</w:t>
-      </w:r>
-    </w:p>
-    <w:p>
-      <w:pPr>
-        <w:pStyle w:val="ListBullet"/>
-        <w:spacing w:after="40"/>
-      </w:pPr>
+        <w:t>Attendu</w:t>
+      </w:r>
+      <w:r>
+        <w:t xml:space="preserve"> : sous la ligne tomate « = 72 boîtes à 250 F/boîte » ; lot et date exigés pour le lait et le jus (date passée refusée). Total </w:t>
+      </w:r>
       <w:r>
         <w:rPr>
           <w:b/>
         </w:rPr>
-        <w:t>Étapes</w:t>
-      </w:r>
-      <w:r>
-        <w:t xml:space="preserve"> : nouvelle réception, Tomate — Carton de 24, qté </w:t>
-      </w:r>
-      <w:r>
-        <w:rPr>
-          <w:b/>
-        </w:rPr>
-        <w:t>2</w:t>
-      </w:r>
-      <w:r>
-        <w:t xml:space="preserve">, prix </w:t>
-      </w:r>
-      <w:r>
-        <w:rPr>
-          <w:b/>
-        </w:rPr>
-        <w:t>6 600</w:t>
-      </w:r>
-      <w:r>
-        <w:t>.</w:t>
-      </w:r>
-    </w:p>
-    <w:p>
-      <w:pPr>
-        <w:pStyle w:val="ListBullet"/>
-        <w:spacing w:after="40"/>
-      </w:pPr>
-      <w:r>
-        <w:rPr>
-          <w:b/>
-        </w:rPr>
-        <w:t>Attendu</w:t>
-      </w:r>
-      <w:r>
-        <w:t xml:space="preserve"> : « = 48 boîtes à 275 F/boîte ». Nouveau coût moyen = (stock avant × 250 + 48 × 275) / (stock avant + 48). Avec 144 boîtes avant : 49 200 / 192 = </w:t>
-      </w:r>
-      <w:r>
-        <w:rPr>
-          <w:b/>
-        </w:rPr>
-        <w:t>256,25</w:t>
-      </w:r>
-      <w:r>
-        <w:t xml:space="preserve">. (Le cas de référence 46 boîtes → </w:t>
-      </w:r>
-      <w:r>
-        <w:rPr>
-          <w:b/>
-        </w:rPr>
-        <w:t>262,8</w:t>
-      </w:r>
-      <w:r>
-        <w:t xml:space="preserve"> est vérifié par les tests automatiques.)</w:t>
-      </w:r>
-    </w:p>
-    <w:p>
-      <w:pPr>
-        <w:pStyle w:val="ListBullet"/>
-        <w:spacing w:after="40"/>
-      </w:pPr>
-      <w:r>
-        <w:rPr>
-          <w:b/>
-        </w:rPr>
-        <w:t>Résultat</w:t>
-      </w:r>
-      <w:r>
-        <w:t xml:space="preserve"> : ☐ OK ☐ KO — remarque :</w:t>
-      </w:r>
-    </w:p>
-    <w:p>
-      <w:pPr>
-        <w:pStyle w:val="Heading2"/>
-      </w:pPr>
-      <w:r>
-        <w:t>KOS-11 — Péremptions et retrait d'un lot</w:t>
-      </w:r>
-    </w:p>
-    <w:p>
-      <w:pPr>
-        <w:pStyle w:val="ListBullet"/>
-        <w:spacing w:after="40"/>
-      </w:pPr>
-      <w:r>
-        <w:rPr>
-          <w:b/>
-        </w:rPr>
-        <w:t>Pré-requis</w:t>
-      </w:r>
-      <w:r>
-        <w:t xml:space="preserve"> : base neuve (avant KOS-09).</w:t>
-      </w:r>
-    </w:p>
-    <w:p>
-      <w:pPr>
-        <w:pStyle w:val="ListBullet"/>
-        <w:spacing w:after="40"/>
-      </w:pPr>
-      <w:r>
-        <w:rPr>
-          <w:b/>
-        </w:rPr>
-        <w:t>Étapes</w:t>
-      </w:r>
-      <w:r>
-        <w:t xml:space="preserve"> : « Péremptions » ; icône « Retirer » sur Jus d'ananas · DEMO-01, quantité 1, commentaire « emballage percé ».</w:t>
-      </w:r>
-    </w:p>
-    <w:p>
-      <w:pPr>
-        <w:pStyle w:val="ListBullet"/>
-        <w:spacing w:after="40"/>
-      </w:pPr>
-      <w:r>
-        <w:rPr>
-          <w:b/>
-        </w:rPr>
-        <w:t>Attendu</w:t>
-      </w:r>
-      <w:r>
-        <w:t xml:space="preserve"> : lignes ambre (10 j) : Lait DEMO-01, 12 × 2 100 = </w:t>
-      </w:r>
-      <w:r>
-        <w:rPr>
-          <w:b/>
-        </w:rPr>
-        <w:t>25 200 F</w:t>
-      </w:r>
-      <w:r>
-        <w:t xml:space="preserve"> ; Jus DEMO-01, 18 × 420 = </w:t>
-      </w:r>
-      <w:r>
-        <w:rPr>
-          <w:b/>
-        </w:rPr>
-        <w:t>7 560 F</w:t>
-      </w:r>
-      <w:r>
-        <w:t xml:space="preserve"> ; valeur en jeu </w:t>
-      </w:r>
-      <w:r>
-        <w:rPr>
-          <w:b/>
-        </w:rPr>
-        <w:t>32 760 F</w:t>
-      </w:r>
-      <w:r>
-        <w:t>. Rouge à 3 jours ou moins, « Périmé depuis N j » pour un lot dépassé. Après le retrait : jus 17, perte au prix d'achat 420 F, valeur en jeu 32 340 F. « Promo −20 % » grisé (promotions programmées à venir).</w:t>
-      </w:r>
-    </w:p>
-    <w:p>
-      <w:pPr>
-        <w:pStyle w:val="ListBullet"/>
-        <w:spacing w:after="40"/>
-      </w:pPr>
-      <w:r>
-        <w:rPr>
-          <w:b/>
-        </w:rPr>
-        <w:t>Résultat</w:t>
-      </w:r>
-      <w:r>
-        <w:t xml:space="preserve"> : ☐ OK ☐ KO — remarque :</w:t>
-      </w:r>
-    </w:p>
-    <w:p>
-      <w:pPr>
-        <w:pStyle w:val="Heading2"/>
-      </w:pPr>
-      <w:r>
-        <w:t>KOS-12 — Sortie de stock et retour fournisseur (avoir attendu)</w:t>
-      </w:r>
-    </w:p>
-    <w:p>
-      <w:pPr>
-        <w:pStyle w:val="ListBullet"/>
-        <w:spacing w:after="40"/>
-      </w:pPr>
-      <w:r>
-        <w:rPr>
-          <w:b/>
-        </w:rPr>
-        <w:t>Étapes</w:t>
-      </w:r>
-      <w:r>
-        <w:t xml:space="preserve"> : « Sorties de stock », scanner la tomate ; quantité </w:t>
-      </w:r>
-      <w:r>
-        <w:rPr>
-          <w:b/>
-        </w:rPr>
-        <w:t>2</w:t>
-      </w:r>
-      <w:r>
-        <w:t>, motif « Défectueux ou casse », commentaire « boîtes bombées », cocher « Retour au fournisseur » (Grossiste) ; valider. Puis une sortie « Don » d'un savon.</w:t>
-      </w:r>
-    </w:p>
-    <w:p>
-      <w:pPr>
-        <w:pStyle w:val="ListBullet"/>
-        <w:spacing w:after="40"/>
-      </w:pPr>
-      <w:r>
-        <w:rPr>
-          <w:b/>
-        </w:rPr>
-        <w:t>Attendu</w:t>
-      </w:r>
-      <w:r>
-        <w:t xml:space="preserve"> : mouvement </w:t>
+        <w:t>45 600 F</w:t>
+      </w:r>
+      <w:r>
+        <w:t xml:space="preserve"> (18 000 + 25 200 + 2 400). Numéro </w:t>
       </w:r>
       <w:r>
         <w:rPr>
@@ -4723,37 +4581,19 @@
           <w:color w:val="13294B"/>
           <w:sz w:val="18"/>
         </w:rPr>
-        <w:t>retour_fournisseur</w:t>
-      </w:r>
-      <w:r>
-        <w:t xml:space="preserve"> −2. Avoir attendu = 2 × </w:t>
+        <w:t>RC</w:t>
+      </w:r>
+      <w:r>
+        <w:t xml:space="preserve"> attribué à la validation. Tomate : stock +72, coût moyen </w:t>
       </w:r>
       <w:r>
         <w:rPr>
           <w:b/>
         </w:rPr>
-        <w:t>dernier prix payé à ce fournisseur pour la tomate</w:t>
-      </w:r>
-      <w:r>
-        <w:t xml:space="preserve"> : 2 × 250 = </w:t>
-      </w:r>
-      <w:r>
-        <w:rPr>
-          <w:b/>
-        </w:rPr>
-        <w:t>500 F</w:t>
-      </w:r>
-      <w:r>
-        <w:t xml:space="preserve"> après KOS-09 seul, 2 × 275 = </w:t>
-      </w:r>
-      <w:r>
-        <w:rPr>
-          <w:b/>
-        </w:rPr>
-        <w:t>550 F</w:t>
-      </w:r>
-      <w:r>
-        <w:t xml:space="preserve"> après KOS-10. Quantité supérieure au stock refusée. Le don sort en « Défectueux ou casse » libellé « Don ».</w:t>
+        <w:t>250</w:t>
+      </w:r>
+      <w:r>
+        <w:t>. Dette du Grossiste = 45 600 F, échéance aujourd'hui + 15 j. Commande liée : « Reçue ». Une réception validée ne se modifie plus.</w:t>
       </w:r>
     </w:p>
     <w:p>
@@ -4776,7 +4616,7 @@
         <w:pStyle w:val="Heading2"/>
       </w:pPr>
       <w:r>
-        <w:t>KOS-13 — Annuler une sortie</w:t>
+        <w:t>KOS-10 — Évolution du coût moyen (CUMP)</w:t>
       </w:r>
     </w:p>
     <w:p>
@@ -4791,7 +4631,25 @@
         <w:t>Étapes</w:t>
       </w:r>
       <w:r>
-        <w:t xml:space="preserve"> : icône « Annuler » sur le don de savon, motif.</w:t>
+        <w:t xml:space="preserve"> : nouvelle réception, Tomate — Carton de 24, qté </w:t>
+      </w:r>
+      <w:r>
+        <w:rPr>
+          <w:b/>
+        </w:rPr>
+        <w:t>2</w:t>
+      </w:r>
+      <w:r>
+        <w:t xml:space="preserve">, prix </w:t>
+      </w:r>
+      <w:r>
+        <w:rPr>
+          <w:b/>
+        </w:rPr>
+        <w:t>6 600</w:t>
+      </w:r>
+      <w:r>
+        <w:t>.</w:t>
       </w:r>
     </w:p>
     <w:p>
@@ -4806,7 +4664,25 @@
         <w:t>Attendu</w:t>
       </w:r>
       <w:r>
-        <w:t xml:space="preserve"> : contre-passation, le savon revient ; la ligne reste visible « Annulée » avec le motif. Une sortie dont l'avoir est reçu ou refusé ne s'annule plus.</w:t>
+        <w:t xml:space="preserve"> : « = 48 boîtes à 275 F/boîte ». Nouveau coût moyen = (stock avant × 250 + 48 × 275) / (stock avant + 48). Avec 144 boîtes avant : 49 200 / 192 = </w:t>
+      </w:r>
+      <w:r>
+        <w:rPr>
+          <w:b/>
+        </w:rPr>
+        <w:t>256,25</w:t>
+      </w:r>
+      <w:r>
+        <w:t xml:space="preserve">. (Le cas de référence 46 boîtes → </w:t>
+      </w:r>
+      <w:r>
+        <w:rPr>
+          <w:b/>
+        </w:rPr>
+        <w:t>262,8</w:t>
+      </w:r>
+      <w:r>
+        <w:t xml:space="preserve"> est vérifié par les tests automatiques.)</w:t>
       </w:r>
     </w:p>
     <w:p>
@@ -4829,7 +4705,7 @@
         <w:pStyle w:val="Heading2"/>
       </w:pPr>
       <w:r>
-        <w:t>KOS-14 — Dettes, règlements et avoirs</w:t>
+        <w:t>KOS-11 — Péremptions et retrait d'un lot</w:t>
       </w:r>
     </w:p>
     <w:p>
@@ -4841,55 +4717,10 @@
         <w:rPr>
           <w:b/>
         </w:rPr>
-        <w:t>Étapes</w:t>
-      </w:r>
-      <w:r>
-        <w:t xml:space="preserve"> (page Fournisseurs, Grossiste) :</w:t>
-      </w:r>
-    </w:p>
-    <w:p>
-      <w:pPr>
-        <w:pStyle w:val="ListNumber2"/>
-        <w:spacing w:after="40"/>
-      </w:pPr>
-      <w:r>
-        <w:t xml:space="preserve">« Payer » : règlement global </w:t>
-      </w:r>
-      <w:r>
-        <w:rPr>
-          <w:b/>
-        </w:rPr>
-        <w:t>20 000</w:t>
-      </w:r>
-      <w:r>
-        <w:t xml:space="preserve"> en espèces ;</w:t>
-      </w:r>
-    </w:p>
-    <w:p>
-      <w:pPr>
-        <w:pStyle w:val="ListNumber2"/>
-        <w:spacing w:after="40"/>
-      </w:pPr>
-      <w:r>
-        <w:t>« Dettes » : annuler ce règlement (motif), puis le ressaisir ;</w:t>
-      </w:r>
-    </w:p>
-    <w:p>
-      <w:pPr>
-        <w:pStyle w:val="ListNumber2"/>
-        <w:spacing w:after="40"/>
-      </w:pPr>
-      <w:r>
-        <w:t>sur l'avoir attendu de KOS-12, « Avoir reçu », montant égal à l'attendu ;</w:t>
-      </w:r>
-    </w:p>
-    <w:p>
-      <w:pPr>
-        <w:pStyle w:val="ListNumber2"/>
-        <w:spacing w:after="40"/>
-      </w:pPr>
-      <w:r>
-        <w:t>essayer un règlement supérieur au reste dû.</w:t>
+        <w:t>Pré-requis</w:t>
+      </w:r>
+      <w:r>
+        <w:t xml:space="preserve"> : base neuve (avant KOS-09).</w:t>
       </w:r>
     </w:p>
     <w:p>
@@ -4901,10 +4732,10 @@
         <w:rPr>
           <w:b/>
         </w:rPr>
-        <w:t>Attendu</w:t>
-      </w:r>
-      <w:r>
-        <w:t xml:space="preserve"> : le règlement global paie d'abord la réception la plus ancienne. Le règlement annulé reste visible et ne compte plus. Solde dû = réceptions − règlements − avoirs reçus (chiffres exacts dans la semaine enchaînée, SEM-09 : 56 400 − 20 000 − 550 = 35 850 F). Un règlement au-delà du reste dû est refusé. Échéance passée : « En retard de N j » en rouge, et le total en retard en tête de page.</w:t>
+        <w:t>Étapes</w:t>
+      </w:r>
+      <w:r>
+        <w:t xml:space="preserve"> : « Péremptions » ; icône « Retirer » sur Jus d'ananas · DEMO-01, quantité 1, commentaire « emballage percé ».</w:t>
       </w:r>
     </w:p>
     <w:p>
@@ -4916,18 +4747,37 @@
         <w:rPr>
           <w:b/>
         </w:rPr>
-        <w:t>Résultat</w:t>
-      </w:r>
-      <w:r>
-        <w:t xml:space="preserve"> : ☐ OK ☐ KO — remarque :</w:t>
-      </w:r>
-    </w:p>
-    <w:p>
-      <w:pPr>
-        <w:pStyle w:val="Heading2"/>
-      </w:pPr>
-      <w:r>
-        <w:t>KOS-15 — Achats d'un fournisseur</w:t>
+        <w:t>Attendu</w:t>
+      </w:r>
+      <w:r>
+        <w:t xml:space="preserve"> : lignes ambre (10 j) : Lait DEMO-01, 12 × 2 100 = </w:t>
+      </w:r>
+      <w:r>
+        <w:rPr>
+          <w:b/>
+        </w:rPr>
+        <w:t>25 200 F</w:t>
+      </w:r>
+      <w:r>
+        <w:t xml:space="preserve"> ; Jus DEMO-01, 18 × 420 = </w:t>
+      </w:r>
+      <w:r>
+        <w:rPr>
+          <w:b/>
+        </w:rPr>
+        <w:t>7 560 F</w:t>
+      </w:r>
+      <w:r>
+        <w:t xml:space="preserve"> ; valeur en jeu </w:t>
+      </w:r>
+      <w:r>
+        <w:rPr>
+          <w:b/>
+        </w:rPr>
+        <w:t>32 760 F</w:t>
+      </w:r>
+      <w:r>
+        <w:t>. Rouge à 3 jours ou moins, « Périmé depuis N j » pour un lot dépassé. Après le retrait : jus 17, perte au prix d'achat 420 F, valeur en jeu 32 340 F. « Promo −20 % » grisé (promotions programmées à venir).</w:t>
       </w:r>
     </w:p>
     <w:p>
@@ -4939,10 +4789,18 @@
         <w:rPr>
           <w:b/>
         </w:rPr>
-        <w:t>Étapes</w:t>
-      </w:r>
-      <w:r>
-        <w:t xml:space="preserve"> : icône « Achats » du Grossiste.</w:t>
+        <w:t>Résultat</w:t>
+      </w:r>
+      <w:r>
+        <w:t xml:space="preserve"> : ☐ OK ☐ KO — remarque :</w:t>
+      </w:r>
+    </w:p>
+    <w:p>
+      <w:pPr>
+        <w:pStyle w:val="Heading2"/>
+      </w:pPr>
+      <w:r>
+        <w:t>KOS-12 — Sortie de stock et retour fournisseur (avoir attendu)</w:t>
       </w:r>
     </w:p>
     <w:p>
@@ -4954,10 +4812,19 @@
         <w:rPr>
           <w:b/>
         </w:rPr>
-        <w:t>Attendu</w:t>
-      </w:r>
-      <w:r>
-        <w:t xml:space="preserve"> : les livraisons des 90 derniers jours avec leur total ; pour chaque conditionnement, le dernier prix payé (Carton de 24 : 6 600 F après KOS-10, écart +600 F avec la livraison précédente, en ambre) ; icône « œil » → détail de la réception.</w:t>
+        <w:t>Étapes</w:t>
+      </w:r>
+      <w:r>
+        <w:t xml:space="preserve"> : « Sorties de stock », scanner la tomate ; quantité </w:t>
+      </w:r>
+      <w:r>
+        <w:rPr>
+          <w:b/>
+        </w:rPr>
+        <w:t>2</w:t>
+      </w:r>
+      <w:r>
+        <w:t>, motif « Défectueux ou casse », commentaire « boîtes bombées », cocher « Retour au fournisseur » (Grossiste) ; valider. Puis une sortie « Don » d'un savon.</w:t>
       </w:r>
     </w:p>
     <w:p>
@@ -4969,66 +4836,10 @@
         <w:rPr>
           <w:b/>
         </w:rPr>
-        <w:t>Résultat</w:t>
-      </w:r>
-      <w:r>
-        <w:t xml:space="preserve"> : ☐ OK ☐ KO — remarque :</w:t>
-      </w:r>
-    </w:p>
-    <w:p>
-      <w:pPr>
-        <w:pStyle w:val="Heading2"/>
-      </w:pPr>
-      <w:r>
-        <w:t>KOS-16 — Inventaire</w:t>
-      </w:r>
-    </w:p>
-    <w:p>
-      <w:pPr>
-        <w:pStyle w:val="ListBullet"/>
-        <w:spacing w:after="40"/>
-      </w:pPr>
-      <w:r>
-        <w:rPr>
-          <w:b/>
-        </w:rPr>
-        <w:t>Étapes</w:t>
-      </w:r>
-      <w:r>
-        <w:t xml:space="preserve"> : « Ouvrir un inventaire » (rayon Entretien, ou tout le magasin) ; compter le savon : </w:t>
-      </w:r>
-      <w:r>
-        <w:rPr>
-          <w:b/>
-        </w:rPr>
-        <w:t>28</w:t>
-      </w:r>
-      <w:r>
-        <w:t xml:space="preserve"> unités (stock 30), motif « Vol », commentaire « vol présumé » ; compter la tomate par conditionnements jusqu'au stock exact (ex. 1 carton + 5 lots + 2 unités = </w:t>
-      </w:r>
-      <w:r>
-        <w:rPr>
-          <w:b/>
-        </w:rPr>
-        <w:t>41</w:t>
-      </w:r>
-      <w:r>
-        <w:t>) ; valider.</w:t>
-      </w:r>
-    </w:p>
-    <w:p>
-      <w:pPr>
-        <w:pStyle w:val="ListBullet"/>
-        <w:spacing w:after="40"/>
-      </w:pPr>
-      <w:r>
-        <w:rPr>
-          <w:b/>
-        </w:rPr>
         <w:t>Attendu</w:t>
       </w:r>
       <w:r>
-        <w:t xml:space="preserve"> : numéro </w:t>
+        <w:t xml:space="preserve"> : mouvement </w:t>
       </w:r>
       <w:r>
         <w:rPr>
@@ -5036,19 +4847,37 @@
           <w:color w:val="13294B"/>
           <w:sz w:val="18"/>
         </w:rPr>
-        <w:t>INV</w:t>
-      </w:r>
-      <w:r>
-        <w:t xml:space="preserve"> dès l'ouverture ; motif obligatoire si écart ; recomptage = remplace ; produits non comptés annoncés (leur stock ne change pas). À la validation : savon −2, </w:t>
+        <w:t>retour_fournisseur</w:t>
+      </w:r>
+      <w:r>
+        <w:t xml:space="preserve"> −2. Avoir attendu = 2 × </w:t>
       </w:r>
       <w:r>
         <w:rPr>
           <w:b/>
         </w:rPr>
-        <w:t>démarque 2 × 150 = 300 F</w:t>
-      </w:r>
-      <w:r>
-        <w:t xml:space="preserve"> ; tomate écart 0. L'inventaire validé est figé ; icône « œil » → détail et export. Un seul inventaire en cours à la fois.</w:t>
+        <w:t>dernier prix payé à ce fournisseur pour la tomate</w:t>
+      </w:r>
+      <w:r>
+        <w:t xml:space="preserve"> : 2 × 250 = </w:t>
+      </w:r>
+      <w:r>
+        <w:rPr>
+          <w:b/>
+        </w:rPr>
+        <w:t>500 F</w:t>
+      </w:r>
+      <w:r>
+        <w:t xml:space="preserve"> après KOS-09 seul, 2 × 275 = </w:t>
+      </w:r>
+      <w:r>
+        <w:rPr>
+          <w:b/>
+        </w:rPr>
+        <w:t>550 F</w:t>
+      </w:r>
+      <w:r>
+        <w:t xml:space="preserve"> après KOS-10. Quantité supérieure au stock refusée. Le don sort en « Défectueux ou casse » libellé « Don ».</w:t>
       </w:r>
     </w:p>
     <w:p>
@@ -5071,7 +4900,7 @@
         <w:pStyle w:val="Heading2"/>
       </w:pPr>
       <w:r>
-        <w:t>KOS-17 — Dépenses</w:t>
+        <w:t>KOS-13 — Annuler une sortie</w:t>
       </w:r>
     </w:p>
     <w:p>
@@ -5086,25 +4915,7 @@
         <w:t>Étapes</w:t>
       </w:r>
       <w:r>
-        <w:t xml:space="preserve"> : « Nouvelle dépense » : Transport, « taxi-moto », </w:t>
-      </w:r>
-      <w:r>
-        <w:rPr>
-          <w:b/>
-        </w:rPr>
-        <w:t>1 000</w:t>
-      </w:r>
-      <w:r>
-        <w:t xml:space="preserve">, « Fonds propres » ; puis Loyer </w:t>
-      </w:r>
-      <w:r>
-        <w:rPr>
-          <w:b/>
-        </w:rPr>
-        <w:t>15 000</w:t>
-      </w:r>
-      <w:r>
-        <w:t xml:space="preserve"> ; filtrer par catégorie ; annuler le loyer (motif) ; essayer la source « Caisse » ; « Catégories » : créer « Gardiennage », désactiver « Eau ».</w:t>
+        <w:t xml:space="preserve"> : icône « Annuler » sur le don de savon, motif.</w:t>
       </w:r>
     </w:p>
     <w:p>
@@ -5119,7 +4930,229 @@
         <w:t>Attendu</w:t>
       </w:r>
       <w:r>
-        <w:t xml:space="preserve"> : </w:t>
+        <w:t xml:space="preserve"> : contre-passation, le savon revient ; la ligne reste visible « Annulée » avec le motif. Une sortie dont l'avoir est reçu ou refusé ne s'annule plus.</w:t>
+      </w:r>
+    </w:p>
+    <w:p>
+      <w:pPr>
+        <w:pStyle w:val="ListBullet"/>
+        <w:spacing w:after="40"/>
+      </w:pPr>
+      <w:r>
+        <w:rPr>
+          <w:b/>
+        </w:rPr>
+        <w:t>Résultat</w:t>
+      </w:r>
+      <w:r>
+        <w:t xml:space="preserve"> : ☐ OK ☐ KO — remarque :</w:t>
+      </w:r>
+    </w:p>
+    <w:p>
+      <w:pPr>
+        <w:pStyle w:val="Heading2"/>
+      </w:pPr>
+      <w:r>
+        <w:t>KOS-14 — Dettes, règlements et avoirs</w:t>
+      </w:r>
+    </w:p>
+    <w:p>
+      <w:pPr>
+        <w:pStyle w:val="ListBullet"/>
+        <w:spacing w:after="40"/>
+      </w:pPr>
+      <w:r>
+        <w:rPr>
+          <w:b/>
+        </w:rPr>
+        <w:t>Étapes</w:t>
+      </w:r>
+      <w:r>
+        <w:t xml:space="preserve"> (page Fournisseurs, Grossiste) :</w:t>
+      </w:r>
+    </w:p>
+    <w:p>
+      <w:pPr>
+        <w:pStyle w:val="ListNumber2"/>
+        <w:spacing w:after="40"/>
+      </w:pPr>
+      <w:r>
+        <w:t xml:space="preserve">« Payer » : règlement global </w:t>
+      </w:r>
+      <w:r>
+        <w:rPr>
+          <w:b/>
+        </w:rPr>
+        <w:t>20 000</w:t>
+      </w:r>
+      <w:r>
+        <w:t xml:space="preserve"> en espèces ;</w:t>
+      </w:r>
+    </w:p>
+    <w:p>
+      <w:pPr>
+        <w:pStyle w:val="ListNumber2"/>
+        <w:spacing w:after="40"/>
+      </w:pPr>
+      <w:r>
+        <w:t>« Dettes » : annuler ce règlement (motif), puis le ressaisir ;</w:t>
+      </w:r>
+    </w:p>
+    <w:p>
+      <w:pPr>
+        <w:pStyle w:val="ListNumber2"/>
+        <w:spacing w:after="40"/>
+      </w:pPr>
+      <w:r>
+        <w:t>sur l'avoir attendu de KOS-12, « Avoir reçu », montant égal à l'attendu ;</w:t>
+      </w:r>
+    </w:p>
+    <w:p>
+      <w:pPr>
+        <w:pStyle w:val="ListNumber2"/>
+        <w:spacing w:after="40"/>
+      </w:pPr>
+      <w:r>
+        <w:t>essayer un règlement supérieur au reste dû.</w:t>
+      </w:r>
+    </w:p>
+    <w:p>
+      <w:pPr>
+        <w:pStyle w:val="ListBullet"/>
+        <w:spacing w:after="40"/>
+      </w:pPr>
+      <w:r>
+        <w:rPr>
+          <w:b/>
+        </w:rPr>
+        <w:t>Attendu</w:t>
+      </w:r>
+      <w:r>
+        <w:t xml:space="preserve"> : le règlement global paie d'abord la réception la plus ancienne. Le règlement annulé reste visible et ne compte plus. Solde dû = réceptions − règlements − avoirs reçus (chiffres exacts dans la semaine enchaînée, SEM-09 : 56 400 − 20 000 − 550 = 35 850 F). Un règlement au-delà du reste dû est refusé. Échéance passée : « En retard de N j » en rouge, et le total en retard en tête de page.</w:t>
+      </w:r>
+    </w:p>
+    <w:p>
+      <w:pPr>
+        <w:pStyle w:val="ListBullet"/>
+        <w:spacing w:after="40"/>
+      </w:pPr>
+      <w:r>
+        <w:rPr>
+          <w:b/>
+        </w:rPr>
+        <w:t>Résultat</w:t>
+      </w:r>
+      <w:r>
+        <w:t xml:space="preserve"> : ☐ OK ☐ KO — remarque :</w:t>
+      </w:r>
+    </w:p>
+    <w:p>
+      <w:pPr>
+        <w:pStyle w:val="Heading2"/>
+      </w:pPr>
+      <w:r>
+        <w:t>KOS-15 — Achats d'un fournisseur</w:t>
+      </w:r>
+    </w:p>
+    <w:p>
+      <w:pPr>
+        <w:pStyle w:val="ListBullet"/>
+        <w:spacing w:after="40"/>
+      </w:pPr>
+      <w:r>
+        <w:rPr>
+          <w:b/>
+        </w:rPr>
+        <w:t>Étapes</w:t>
+      </w:r>
+      <w:r>
+        <w:t xml:space="preserve"> : icône « Achats » du Grossiste.</w:t>
+      </w:r>
+    </w:p>
+    <w:p>
+      <w:pPr>
+        <w:pStyle w:val="ListBullet"/>
+        <w:spacing w:after="40"/>
+      </w:pPr>
+      <w:r>
+        <w:rPr>
+          <w:b/>
+        </w:rPr>
+        <w:t>Attendu</w:t>
+      </w:r>
+      <w:r>
+        <w:t xml:space="preserve"> : les livraisons des 90 derniers jours avec leur total ; pour chaque conditionnement, le dernier prix payé (Carton de 24 : 6 600 F après KOS-10, écart +600 F avec la livraison précédente, en ambre) ; icône « œil » → détail de la réception.</w:t>
+      </w:r>
+    </w:p>
+    <w:p>
+      <w:pPr>
+        <w:pStyle w:val="ListBullet"/>
+        <w:spacing w:after="40"/>
+      </w:pPr>
+      <w:r>
+        <w:rPr>
+          <w:b/>
+        </w:rPr>
+        <w:t>Résultat</w:t>
+      </w:r>
+      <w:r>
+        <w:t xml:space="preserve"> : ☐ OK ☐ KO — remarque :</w:t>
+      </w:r>
+    </w:p>
+    <w:p>
+      <w:pPr>
+        <w:pStyle w:val="Heading2"/>
+      </w:pPr>
+      <w:r>
+        <w:t>KOS-16 — Inventaire</w:t>
+      </w:r>
+    </w:p>
+    <w:p>
+      <w:pPr>
+        <w:pStyle w:val="ListBullet"/>
+        <w:spacing w:after="40"/>
+      </w:pPr>
+      <w:r>
+        <w:rPr>
+          <w:b/>
+        </w:rPr>
+        <w:t>Étapes</w:t>
+      </w:r>
+      <w:r>
+        <w:t xml:space="preserve"> : « Ouvrir un inventaire » (rayon Entretien, ou tout le magasin) ; compter le savon : </w:t>
+      </w:r>
+      <w:r>
+        <w:rPr>
+          <w:b/>
+        </w:rPr>
+        <w:t>28</w:t>
+      </w:r>
+      <w:r>
+        <w:t xml:space="preserve"> unités (stock 30), motif « Vol », commentaire « vol présumé » ; compter la tomate par conditionnements jusqu'au stock exact (ex. 1 carton + 5 lots + 2 unités = </w:t>
+      </w:r>
+      <w:r>
+        <w:rPr>
+          <w:b/>
+        </w:rPr>
+        <w:t>41</w:t>
+      </w:r>
+      <w:r>
+        <w:t>) ; valider.</w:t>
+      </w:r>
+    </w:p>
+    <w:p>
+      <w:pPr>
+        <w:pStyle w:val="ListBullet"/>
+        <w:spacing w:after="40"/>
+      </w:pPr>
+      <w:r>
+        <w:rPr>
+          <w:b/>
+        </w:rPr>
+        <w:t>Attendu</w:t>
+      </w:r>
+      <w:r>
+        <w:t xml:space="preserve"> : numéro </w:t>
       </w:r>
       <w:r>
         <w:rPr>
@@ -5127,6 +5160,97 @@
           <w:color w:val="13294B"/>
           <w:sz w:val="18"/>
         </w:rPr>
+        <w:t>INV</w:t>
+      </w:r>
+      <w:r>
+        <w:t xml:space="preserve"> dès l'ouverture ; motif obligatoire si écart ; recomptage = remplace ; produits non comptés annoncés (leur stock ne change pas). À la validation : savon −2, </w:t>
+      </w:r>
+      <w:r>
+        <w:rPr>
+          <w:b/>
+        </w:rPr>
+        <w:t>démarque 2 × 150 = 300 F</w:t>
+      </w:r>
+      <w:r>
+        <w:t xml:space="preserve"> ; tomate écart 0. L'inventaire validé est figé ; icône « œil » → détail et export. Un seul inventaire en cours à la fois.</w:t>
+      </w:r>
+    </w:p>
+    <w:p>
+      <w:pPr>
+        <w:pStyle w:val="ListBullet"/>
+        <w:spacing w:after="40"/>
+      </w:pPr>
+      <w:r>
+        <w:rPr>
+          <w:b/>
+        </w:rPr>
+        <w:t>Résultat</w:t>
+      </w:r>
+      <w:r>
+        <w:t xml:space="preserve"> : ☐ OK ☐ KO — remarque :</w:t>
+      </w:r>
+    </w:p>
+    <w:p>
+      <w:pPr>
+        <w:pStyle w:val="Heading2"/>
+      </w:pPr>
+      <w:r>
+        <w:t>KOS-17 — Dépenses</w:t>
+      </w:r>
+    </w:p>
+    <w:p>
+      <w:pPr>
+        <w:pStyle w:val="ListBullet"/>
+        <w:spacing w:after="40"/>
+      </w:pPr>
+      <w:r>
+        <w:rPr>
+          <w:b/>
+        </w:rPr>
+        <w:t>Étapes</w:t>
+      </w:r>
+      <w:r>
+        <w:t xml:space="preserve"> : « Nouvelle dépense » : Transport, « taxi-moto », </w:t>
+      </w:r>
+      <w:r>
+        <w:rPr>
+          <w:b/>
+        </w:rPr>
+        <w:t>1 000</w:t>
+      </w:r>
+      <w:r>
+        <w:t xml:space="preserve">, « Fonds propres » ; puis Loyer </w:t>
+      </w:r>
+      <w:r>
+        <w:rPr>
+          <w:b/>
+        </w:rPr>
+        <w:t>15 000</w:t>
+      </w:r>
+      <w:r>
+        <w:t xml:space="preserve"> ; filtrer par catégorie ; annuler le loyer (motif) ; choisir la source « Caisse » sans caisse ouverte ; « Catégories » : créer « Gardiennage », désactiver « Eau ».</w:t>
+      </w:r>
+    </w:p>
+    <w:p>
+      <w:pPr>
+        <w:pStyle w:val="ListBullet"/>
+        <w:spacing w:after="40"/>
+      </w:pPr>
+      <w:r>
+        <w:rPr>
+          <w:b/>
+        </w:rPr>
+        <w:t>Attendu</w:t>
+      </w:r>
+      <w:r>
+        <w:t xml:space="preserve"> : </w:t>
+      </w:r>
+      <w:r>
+        <w:rPr>
+          <w:rFonts w:ascii="Consolas" w:hAnsi="Consolas"/>
+          <w:color w:val="13294B"/>
+          <w:sz w:val="18"/>
+        </w:rPr>
         <w:t>DEP-AAAA-NNNNNN</w:t>
       </w:r>
       <w:r>
@@ -5139,7 +5263,7 @@
         <w:t>1 000 F</w:t>
       </w:r>
       <w:r>
-        <w:t xml:space="preserve"> après annulation (le loyer reste visible, annulé). Date future refusée. Source « Caisse » refusée avec un message clair (en attente, B13). Nom de catégorie déjà pris (même désactivée) refusé.</w:t>
+        <w:t xml:space="preserve"> après annulation (le loyer reste visible, annulé). Date future refusée. Source « Caisse » sans caisse ouverte : « Aucune caisse n'est ouverte » (dépense au tiroir : AFI-15). Nom de catégorie déjà pris (même désactivée) refusé.</w:t>
       </w:r>
     </w:p>
     <w:p>
@@ -9259,34 +9383,6 @@
               <w:rPr>
                 <w:sz w:val="19"/>
               </w:rPr>
-              <w:t>Dépense payée au tiroir (source « Caisse »)</w:t>
-            </w:r>
-          </w:p>
-        </w:tc>
-        <w:tc>
-          <w:tcPr>
-            <w:tcW w:type="dxa" w:w="4819"/>
-          </w:tcPr>
-          <w:p>
-            <w:r>
-              <w:rPr>
-                <w:sz w:val="19"/>
-              </w:rPr>
-              <w:t>fin de B13</w:t>
-            </w:r>
-          </w:p>
-        </w:tc>
-      </w:tr>
-      <w:tr>
-        <w:tc>
-          <w:tcPr>
-            <w:tcW w:type="dxa" w:w="4819"/>
-          </w:tcPr>
-          <w:p>
-            <w:r>
-              <w:rPr>
-                <w:sz w:val="19"/>
-              </w:rPr>
               <w:t>Écran client définitif</w:t>
             </w:r>
           </w:p>
@@ -9444,7 +9540,7 @@
       <w:rPr>
         <w:sz w:val="16"/>
       </w:rPr>
-      <w:t xml:space="preserve">Scénarios de test — Ma Boutique POS — page </w:t>
+      <w:t xml:space="preserve">Scénarios de test de bout en bout — par utilisateur et par cas d'utilisation — page </w:t>
     </w:r>
     <w:r>
       <w:rPr>

</xml_diff>

<commit_message>
feat(rapports): marge et résultat chiffrés depuis les ventes de la période (B14)
- Le résultat prend la marge de `ventesPeriode` (A14, Dev A) sur la même période :
  chiffre d'affaires TTC − coût des marchandises vendues, retours déduits ; résultat = marge − dépenses.
- Onglet « Résultat » et export Excel détaillés (chiffre d'affaires, coût, marge, dépenses, résultat).
- Contrat : ajouts seuls (`RapportResultat.chiffreAffaires`, `cout`).
- Marge TTC seule ; marge HT en attente de la cliente (D-A6).
- B13 → ✅ (PR #74) ; REGLES_METIER § 11.1, UI_UX § 5.20, SCENARIOS_TEST KOS-18.

Co-Authored-By: Claude Opus 5.5 <noreply@anthropic.com>
</commit_message>
<xml_diff>
--- a/docs/SCENARIOS_TEST.docx
+++ b/docs/SCENARIOS_TEST.docx
@@ -5376,7 +5376,7 @@
         <w:t>Résultat</w:t>
       </w:r>
       <w:r>
-        <w:t xml:space="preserve"> : marge « en attente des rapports de ventes » (A14), dépenses (1 000 F).</w:t>
+        <w:t xml:space="preserve"> : chiffre d'affaires et coût des marchandises vendues de la période (retours déduits), marge brute = chiffre d'affaires − coût, puis − dépenses (1 000 F) = résultat ; le chiffre d'affaires est le même que celui des ventes de la période (A14).</w:t>
       </w:r>
     </w:p>
     <w:p>
@@ -9285,7 +9285,7 @@
               <w:rPr>
                 <w:sz w:val="19"/>
               </w:rPr>
-              <w:t>Rapports de ventes, marge et résultat chiffrés</w:t>
+              <w:t>Écran des rapports de ventes (par heure, par caissier, top / flop produits)</w:t>
             </w:r>
           </w:p>
         </w:tc>
@@ -9298,21 +9298,7 @@
               <w:rPr>
                 <w:sz w:val="19"/>
               </w:rPr>
-              <w:t>A14 (</w:t>
-            </w:r>
-            <w:r>
-              <w:rPr>
-                <w:rFonts w:ascii="Consolas" w:hAnsi="Consolas"/>
-                <w:color w:val="13294B"/>
-                <w:sz w:val="19"/>
-              </w:rPr>
-              <w:t>caisse:ventesPeriode</w:t>
-            </w:r>
-            <w:r>
-              <w:rPr>
-                <w:sz w:val="19"/>
-              </w:rPr>
-              <w:t>)</w:t>
+              <w:t>A14 (partie 2)</w:t>
             </w:r>
           </w:p>
         </w:tc>
@@ -9540,7 +9526,7 @@
       <w:rPr>
         <w:sz w:val="16"/>
       </w:rPr>
-      <w:t xml:space="preserve">Scénarios de test de bout en bout — par utilisateur et par cas d'utilisation — page </w:t>
+      <w:t xml:space="preserve">Scénarios de test — Ma Boutique POS — page </w:t>
     </w:r>
     <w:r>
       <w:rPr>

</xml_diff>